<commit_message>
Atualizando questoes ate 10
</commit_message>
<xml_diff>
--- a/Atividade consulta sql.docx
+++ b/Atividade consulta sql.docx
@@ -430,6 +430,9 @@
     <w:p/>
     <w:p>
       <w:r>
+        <w:rPr>
+          <w:noProof/>
+        </w:rPr>
         <w:drawing>
           <wp:inline distT="0" distB="0" distL="0" distR="0" wp14:anchorId="3A757A6A" wp14:editId="726EDB80">
             <wp:extent cx="5400040" cy="847090"/>
@@ -469,6 +472,9 @@
     </w:p>
     <w:p>
       <w:r>
+        <w:rPr>
+          <w:noProof/>
+        </w:rPr>
         <w:lastRenderedPageBreak/>
         <w:drawing>
           <wp:inline distT="0" distB="0" distL="0" distR="0" wp14:anchorId="6362FFE8" wp14:editId="01AD3CA4">
@@ -510,6 +516,9 @@
     <w:p/>
     <w:p>
       <w:r>
+        <w:rPr>
+          <w:noProof/>
+        </w:rPr>
         <w:drawing>
           <wp:inline distT="0" distB="0" distL="0" distR="0" wp14:anchorId="46558183" wp14:editId="2F74669E">
             <wp:extent cx="5400040" cy="877570"/>
@@ -549,6 +558,9 @@
     </w:p>
     <w:p>
       <w:r>
+        <w:rPr>
+          <w:noProof/>
+        </w:rPr>
         <w:drawing>
           <wp:inline distT="0" distB="0" distL="0" distR="0" wp14:anchorId="2FD173F3" wp14:editId="49C83F76">
             <wp:extent cx="5400040" cy="2038350"/>
@@ -589,6 +601,9 @@
     <w:p/>
     <w:p>
       <w:r>
+        <w:rPr>
+          <w:noProof/>
+        </w:rPr>
         <w:drawing>
           <wp:inline distT="0" distB="0" distL="0" distR="0" wp14:anchorId="2457636E" wp14:editId="09286FB8">
             <wp:extent cx="5400040" cy="981710"/>
@@ -626,11 +641,52 @@
         </w:drawing>
       </w:r>
     </w:p>
-    <w:p/>
+    <w:p>
+      <w:r>
+        <w:lastRenderedPageBreak/>
+        <w:drawing>
+          <wp:inline distT="0" distB="0" distL="0" distR="0" wp14:anchorId="68D633C1" wp14:editId="1254603D">
+            <wp:extent cx="5400040" cy="2087880"/>
+            <wp:effectExtent l="0" t="0" r="0" b="7620"/>
+            <wp:docPr id="19" name="Imagem 19"/>
+            <wp:cNvGraphicFramePr>
+              <a:graphicFrameLocks xmlns:a="http://schemas.openxmlformats.org/drawingml/2006/main" noChangeAspect="1"/>
+            </wp:cNvGraphicFramePr>
+            <a:graphic xmlns:a="http://schemas.openxmlformats.org/drawingml/2006/main">
+              <a:graphicData uri="http://schemas.openxmlformats.org/drawingml/2006/picture">
+                <pic:pic xmlns:pic="http://schemas.openxmlformats.org/drawingml/2006/picture">
+                  <pic:nvPicPr>
+                    <pic:cNvPr id="1" name=""/>
+                    <pic:cNvPicPr/>
+                  </pic:nvPicPr>
+                  <pic:blipFill>
+                    <a:blip r:embed="rId19"/>
+                    <a:stretch>
+                      <a:fillRect/>
+                    </a:stretch>
+                  </pic:blipFill>
+                  <pic:spPr>
+                    <a:xfrm>
+                      <a:off x="0" y="0"/>
+                      <a:ext cx="5400040" cy="2087880"/>
+                    </a:xfrm>
+                    <a:prstGeom prst="rect">
+                      <a:avLst/>
+                    </a:prstGeom>
+                  </pic:spPr>
+                </pic:pic>
+              </a:graphicData>
+            </a:graphic>
+          </wp:inline>
+        </w:drawing>
+      </w:r>
+    </w:p>
     <w:p/>
     <w:p>
       <w:r>
-        <w:lastRenderedPageBreak/>
+        <w:rPr>
+          <w:noProof/>
+        </w:rPr>
         <w:drawing>
           <wp:inline distT="0" distB="0" distL="0" distR="0" wp14:anchorId="3D28CBBC" wp14:editId="727CCE89">
             <wp:extent cx="5400040" cy="1806575"/>
@@ -647,7 +703,7 @@
                     <pic:cNvPicPr/>
                   </pic:nvPicPr>
                   <pic:blipFill>
-                    <a:blip r:embed="rId19"/>
+                    <a:blip r:embed="rId20"/>
                     <a:stretch>
                       <a:fillRect/>
                     </a:stretch>
@@ -670,6 +726,9 @@
     </w:p>
     <w:p>
       <w:r>
+        <w:rPr>
+          <w:noProof/>
+        </w:rPr>
         <w:drawing>
           <wp:inline distT="0" distB="0" distL="0" distR="0" wp14:anchorId="2EB1952E" wp14:editId="0FAAA879">
             <wp:extent cx="5400040" cy="3575050"/>
@@ -686,7 +745,7 @@
                     <pic:cNvPicPr/>
                   </pic:nvPicPr>
                   <pic:blipFill>
-                    <a:blip r:embed="rId20"/>
+                    <a:blip r:embed="rId21"/>
                     <a:stretch>
                       <a:fillRect/>
                     </a:stretch>
@@ -709,7 +768,15 @@
     </w:p>
     <w:p/>
     <w:p>
+      <w:pPr>
+        <w:rPr>
+          <w:u w:val="single"/>
+        </w:rPr>
+      </w:pPr>
       <w:r>
+        <w:rPr>
+          <w:noProof/>
+        </w:rPr>
         <w:lastRenderedPageBreak/>
         <w:drawing>
           <wp:inline distT="0" distB="0" distL="0" distR="0" wp14:anchorId="58FBBB13" wp14:editId="748A9867">
@@ -727,7 +794,7 @@
                     <pic:cNvPicPr/>
                   </pic:nvPicPr>
                   <pic:blipFill>
-                    <a:blip r:embed="rId21"/>
+                    <a:blip r:embed="rId22"/>
                     <a:stretch>
                       <a:fillRect/>
                     </a:stretch>
@@ -736,6 +803,45 @@
                     <a:xfrm>
                       <a:off x="0" y="0"/>
                       <a:ext cx="5400040" cy="3181350"/>
+                    </a:xfrm>
+                    <a:prstGeom prst="rect">
+                      <a:avLst/>
+                    </a:prstGeom>
+                  </pic:spPr>
+                </pic:pic>
+              </a:graphicData>
+            </a:graphic>
+          </wp:inline>
+        </w:drawing>
+      </w:r>
+    </w:p>
+    <w:p>
+      <w:r>
+        <w:drawing>
+          <wp:inline distT="0" distB="0" distL="0" distR="0" wp14:anchorId="5A110281" wp14:editId="2175300A">
+            <wp:extent cx="5400040" cy="2602865"/>
+            <wp:effectExtent l="0" t="0" r="0" b="6985"/>
+            <wp:docPr id="20" name="Imagem 20"/>
+            <wp:cNvGraphicFramePr>
+              <a:graphicFrameLocks xmlns:a="http://schemas.openxmlformats.org/drawingml/2006/main" noChangeAspect="1"/>
+            </wp:cNvGraphicFramePr>
+            <a:graphic xmlns:a="http://schemas.openxmlformats.org/drawingml/2006/main">
+              <a:graphicData uri="http://schemas.openxmlformats.org/drawingml/2006/picture">
+                <pic:pic xmlns:pic="http://schemas.openxmlformats.org/drawingml/2006/picture">
+                  <pic:nvPicPr>
+                    <pic:cNvPr id="1" name=""/>
+                    <pic:cNvPicPr/>
+                  </pic:nvPicPr>
+                  <pic:blipFill>
+                    <a:blip r:embed="rId23"/>
+                    <a:stretch>
+                      <a:fillRect/>
+                    </a:stretch>
+                  </pic:blipFill>
+                  <pic:spPr>
+                    <a:xfrm>
+                      <a:off x="0" y="0"/>
+                      <a:ext cx="5400040" cy="2602865"/>
                     </a:xfrm>
                     <a:prstGeom prst="rect">
                       <a:avLst/>

</xml_diff>

<commit_message>
Adicionando a questao 20
</commit_message>
<xml_diff>
--- a/Atividade consulta sql.docx
+++ b/Atividade consulta sql.docx
@@ -1472,6 +1472,9 @@
     <w:p/>
     <w:p>
       <w:r>
+        <w:rPr>
+          <w:noProof/>
+        </w:rPr>
         <w:lastRenderedPageBreak/>
         <w:drawing>
           <wp:inline distT="0" distB="0" distL="0" distR="0" wp14:anchorId="394BAE68" wp14:editId="34FE1490">
@@ -1544,6 +1547,9 @@
     </w:p>
     <w:p>
       <w:r>
+        <w:rPr>
+          <w:noProof/>
+        </w:rPr>
         <w:drawing>
           <wp:inline distT="0" distB="0" distL="0" distR="0" wp14:anchorId="1894500D" wp14:editId="7B835277">
             <wp:extent cx="5400040" cy="3255645"/>
@@ -1821,6 +1827,9 @@
     <w:p/>
     <w:p>
       <w:r>
+        <w:rPr>
+          <w:noProof/>
+        </w:rPr>
         <w:drawing>
           <wp:inline distT="0" distB="0" distL="0" distR="0" wp14:anchorId="6EA04856" wp14:editId="796B1915">
             <wp:extent cx="5400040" cy="2827020"/>
@@ -2033,6 +2042,9 @@
     </w:p>
     <w:p>
       <w:r>
+        <w:rPr>
+          <w:noProof/>
+        </w:rPr>
         <w:drawing>
           <wp:inline distT="0" distB="0" distL="0" distR="0" wp14:anchorId="4C5899B9" wp14:editId="6E447B9D">
             <wp:extent cx="5400040" cy="2932430"/>
@@ -2456,6 +2468,9 @@
     </w:p>
     <w:p>
       <w:r>
+        <w:rPr>
+          <w:noProof/>
+        </w:rPr>
         <w:drawing>
           <wp:inline distT="0" distB="0" distL="0" distR="0" wp14:anchorId="7781B3F2" wp14:editId="36F96151">
             <wp:extent cx="5400040" cy="2733675"/>
@@ -2495,6 +2510,9 @@
     </w:p>
     <w:p>
       <w:r>
+        <w:rPr>
+          <w:noProof/>
+        </w:rPr>
         <w:drawing>
           <wp:inline distT="0" distB="0" distL="0" distR="0" wp14:anchorId="239BB2DC" wp14:editId="48772206">
             <wp:extent cx="5400040" cy="951230"/>
@@ -2534,6 +2552,9 @@
     </w:p>
     <w:p>
       <w:r>
+        <w:rPr>
+          <w:noProof/>
+        </w:rPr>
         <w:lastRenderedPageBreak/>
         <w:drawing>
           <wp:inline distT="0" distB="0" distL="0" distR="0" wp14:anchorId="2FD5FEDE" wp14:editId="4E5F9A0F">
@@ -2574,6 +2595,9 @@
     </w:p>
     <w:p>
       <w:r>
+        <w:rPr>
+          <w:noProof/>
+        </w:rPr>
         <w:drawing>
           <wp:inline distT="0" distB="0" distL="0" distR="0" wp14:anchorId="6FD603E9" wp14:editId="70014B56">
             <wp:extent cx="5400040" cy="1026160"/>
@@ -2613,6 +2637,9 @@
     </w:p>
     <w:p>
       <w:r>
+        <w:rPr>
+          <w:noProof/>
+        </w:rPr>
         <w:drawing>
           <wp:inline distT="0" distB="0" distL="0" distR="0" wp14:anchorId="4B42ACFD" wp14:editId="07CD8829">
             <wp:extent cx="5400040" cy="2667000"/>
@@ -2652,6 +2679,9 @@
     </w:p>
     <w:p>
       <w:r>
+        <w:rPr>
+          <w:noProof/>
+        </w:rPr>
         <w:lastRenderedPageBreak/>
         <w:drawing>
           <wp:inline distT="0" distB="0" distL="0" distR="0" wp14:anchorId="3EA50E01" wp14:editId="3AEACE48">
@@ -2692,6 +2722,9 @@
     </w:p>
     <w:p>
       <w:r>
+        <w:rPr>
+          <w:noProof/>
+        </w:rPr>
         <w:drawing>
           <wp:inline distT="0" distB="0" distL="0" distR="0" wp14:anchorId="4B06DFF5" wp14:editId="04B87E79">
             <wp:extent cx="5400040" cy="3027680"/>
@@ -2731,6 +2764,9 @@
     </w:p>
     <w:p>
       <w:r>
+        <w:rPr>
+          <w:noProof/>
+        </w:rPr>
         <w:drawing>
           <wp:inline distT="0" distB="0" distL="0" distR="0" wp14:anchorId="67B17F3E" wp14:editId="6C6A4F0D">
             <wp:extent cx="5400040" cy="1873250"/>
@@ -2770,6 +2806,9 @@
     </w:p>
     <w:p>
       <w:r>
+        <w:rPr>
+          <w:noProof/>
+        </w:rPr>
         <w:lastRenderedPageBreak/>
         <w:drawing>
           <wp:inline distT="0" distB="0" distL="0" distR="0" wp14:anchorId="3D348D59" wp14:editId="3D22780A">
@@ -2796,6 +2835,85 @@
                     <a:xfrm>
                       <a:off x="0" y="0"/>
                       <a:ext cx="5400040" cy="1936750"/>
+                    </a:xfrm>
+                    <a:prstGeom prst="rect">
+                      <a:avLst/>
+                    </a:prstGeom>
+                  </pic:spPr>
+                </pic:pic>
+              </a:graphicData>
+            </a:graphic>
+          </wp:inline>
+        </w:drawing>
+      </w:r>
+    </w:p>
+    <w:p/>
+    <w:p>
+      <w:r>
+        <w:drawing>
+          <wp:inline distT="0" distB="0" distL="0" distR="0" wp14:anchorId="03797ADC" wp14:editId="5D602C4E">
+            <wp:extent cx="5400040" cy="1437640"/>
+            <wp:effectExtent l="0" t="0" r="0" b="0"/>
+            <wp:docPr id="34" name="Imagem 34"/>
+            <wp:cNvGraphicFramePr>
+              <a:graphicFrameLocks xmlns:a="http://schemas.openxmlformats.org/drawingml/2006/main" noChangeAspect="1"/>
+            </wp:cNvGraphicFramePr>
+            <a:graphic xmlns:a="http://schemas.openxmlformats.org/drawingml/2006/main">
+              <a:graphicData uri="http://schemas.openxmlformats.org/drawingml/2006/picture">
+                <pic:pic xmlns:pic="http://schemas.openxmlformats.org/drawingml/2006/picture">
+                  <pic:nvPicPr>
+                    <pic:cNvPr id="1" name=""/>
+                    <pic:cNvPicPr/>
+                  </pic:nvPicPr>
+                  <pic:blipFill>
+                    <a:blip r:embed="rId37"/>
+                    <a:stretch>
+                      <a:fillRect/>
+                    </a:stretch>
+                  </pic:blipFill>
+                  <pic:spPr>
+                    <a:xfrm>
+                      <a:off x="0" y="0"/>
+                      <a:ext cx="5400040" cy="1437640"/>
+                    </a:xfrm>
+                    <a:prstGeom prst="rect">
+                      <a:avLst/>
+                    </a:prstGeom>
+                  </pic:spPr>
+                </pic:pic>
+              </a:graphicData>
+            </a:graphic>
+          </wp:inline>
+        </w:drawing>
+      </w:r>
+    </w:p>
+    <w:p>
+      <w:r>
+        <w:drawing>
+          <wp:inline distT="0" distB="0" distL="0" distR="0" wp14:anchorId="0ECF4F67" wp14:editId="2B33482C">
+            <wp:extent cx="5400040" cy="1891030"/>
+            <wp:effectExtent l="0" t="0" r="0" b="0"/>
+            <wp:docPr id="35" name="Imagem 35"/>
+            <wp:cNvGraphicFramePr>
+              <a:graphicFrameLocks xmlns:a="http://schemas.openxmlformats.org/drawingml/2006/main" noChangeAspect="1"/>
+            </wp:cNvGraphicFramePr>
+            <a:graphic xmlns:a="http://schemas.openxmlformats.org/drawingml/2006/main">
+              <a:graphicData uri="http://schemas.openxmlformats.org/drawingml/2006/picture">
+                <pic:pic xmlns:pic="http://schemas.openxmlformats.org/drawingml/2006/picture">
+                  <pic:nvPicPr>
+                    <pic:cNvPr id="1" name=""/>
+                    <pic:cNvPicPr/>
+                  </pic:nvPicPr>
+                  <pic:blipFill>
+                    <a:blip r:embed="rId38"/>
+                    <a:stretch>
+                      <a:fillRect/>
+                    </a:stretch>
+                  </pic:blipFill>
+                  <pic:spPr>
+                    <a:xfrm>
+                      <a:off x="0" y="0"/>
+                      <a:ext cx="5400040" cy="1891030"/>
                     </a:xfrm>
                     <a:prstGeom prst="rect">
                       <a:avLst/>
@@ -3419,6 +3537,7 @@
   <w:style w:type="character" w:default="1" w:styleId="Fontepargpadro">
     <w:name w:val="Default Paragraph Font"/>
     <w:uiPriority w:val="1"/>
+    <w:semiHidden/>
     <w:unhideWhenUsed/>
   </w:style>
   <w:style w:type="table" w:default="1" w:styleId="Tabelanormal">

</xml_diff>